<commit_message>
Reporte del viernes: cifras de e13_lookup (39,37/50 sin RAGAS) y lookup en la arquitectura
- total contraverificado con scripts/evaluate.py sobre salidas/sample_e13_lookup.jsonl
- PDF de 1 pagina exportado con Word

Co-Authored-By: Claude Sonnet 5.5 <noreply@anthropic.com>
</commit_message>
<xml_diff>
--- a/entregas/viernes/REPORTE_AVANCE.docx
+++ b/entregas/viernes/REPORTE_AVANCE.docx
@@ -87,7 +87,7 @@
           <w:i w:val="0"/>
           <w:sz w:val="18"/>
         </w:rPr>
-        <w:t xml:space="preserve">    Corrida: e08b_top10 (commit 64e15aa)</w:t>
+        <w:t xml:space="preserve">    Corrida: e13_lookup (commit 3eeeef4)</w:t>
       </w:r>
     </w:p>
     <w:p>
@@ -488,7 +488,7 @@
           <w:i/>
           <w:sz w:val="17"/>
         </w:rPr>
-        <w:t>Referencia adicional con juez RAGAS: correctness 0,466 (13,97/30).</w:t>
+        <w:t>Referencia adicional con juez RAGAS: correctness 0,502 (15,06/30).</w:t>
       </w:r>
     </w:p>
     <w:p>
@@ -969,7 +969,7 @@
                 <w:i w:val="0"/>
                 <w:sz w:val="19"/>
               </w:rPr>
-              <w:t>Híbrida: BM25 (bm25s) + denso, fusión RRF (k=60); top-10 como evidencia, 5 pasajes al decoder; citas validadas contra el top-10</w:t>
+              <w:t>Híbrida: BM25 (bm25s) + denso, fusión RRF (k=60), más búsqueda por referencia explícita (norma/artículo detectados con citations.py) como candidato extra; top-10 como evidencia, 5 pasajes al decoder; citas validadas contra el top-10</w:t>
             </w:r>
           </w:p>
         </w:tc>
@@ -1093,7 +1093,7 @@
           <w:i w:val="0"/>
           <w:sz w:val="20"/>
         </w:rPr>
-        <w:t>4,2 s/pregunta en la RTX 4090 cumple el objetivo (&lt;10 s), pero un Mac M1 tarda ~145 s: se congela una sola máquina y configuración para la corrida final y la verificación en vivo.</w:t>
+        <w:t>4,3 s/pregunta en la RTX 4090 cumple el objetivo (&lt;10 s), pero un Mac M1 tarda ~145 s: se congela una sola máquina y configuración para la corrida final y la verificación en vivo.</w:t>
       </w:r>
     </w:p>
     <w:p>
@@ -1116,7 +1116,7 @@
           <w:i w:val="0"/>
           <w:sz w:val="20"/>
         </w:rPr>
-        <w:t>En muestra, art_hit@10 ≈ 0,4–0,5 y cerradas 0,733 frente a la referencia 0,905. Se prueban reranker, búsqueda por referencia explícita y generation_k, un cambio por experimento.</w:t>
+        <w:t>En muestra, art_hit@10 ≈ 0,4–0,5 y cerradas 0,733 frente a la referencia 0,905. Se prueban reranker, ajuste de la búsqueda por referencia explícita y generation_k, un cambio por experimento.</w:t>
       </w:r>
     </w:p>
     <w:p>

</xml_diff>

<commit_message>
Reporte del viernes: version preliminar con e14_final (39,37/50 sin RAGAS)
- e14_final: misma configuracion que e13 (lookup on), salida identica (comparar_entregas: 0 diferencias)
- reporte.json de e14 generado con scripts/evaluate.py; RAGAS tomado de e13 y anotado en el documento
- build_reporte.py: opcion --commit

Co-Authored-By: Claude Sonnet 5.5 <noreply@anthropic.com>
Claude-Session: https://claude.ai/code/session_01REsYNXurAR9RNVP1dufnHg
</commit_message>
<xml_diff>
--- a/entregas/viernes/REPORTE_AVANCE.docx
+++ b/entregas/viernes/REPORTE_AVANCE.docx
@@ -87,7 +87,7 @@
           <w:i w:val="0"/>
           <w:sz w:val="18"/>
         </w:rPr>
-        <w:t xml:space="preserve">    Corrida: e13_lookup (commit 3eeeef4)</w:t>
+        <w:t xml:space="preserve">    Corrida: e14_final (commit 2137cd5)</w:t>
       </w:r>
     </w:p>
     <w:p>
@@ -488,7 +488,7 @@
           <w:i/>
           <w:sz w:val="17"/>
         </w:rPr>
-        <w:t>Referencia adicional con juez RAGAS: correctness 0,502 (15,06/30).</w:t>
+        <w:t>Referencia adicional con juez RAGAS: correctness 0,502 (15,06/30); medido en e13_lookup (salida identica a e14_final).</w:t>
       </w:r>
     </w:p>
     <w:p>

</xml_diff>

<commit_message>
Reporte del viernes: cifras de e16_area200 (40,59/50 sin RAGAS)
- e16: prioridad por area x2.0 + normas v3 sin filtro; total reverificado con scripts/evaluate.py
- latencia 11,8 s medida con la GPU compartida (e14 sin carga: 4,3 s); se declara en riesgos
- riesgo nuevo: el boost depende del campo area en las 992 preguntas
- build_reporte.py: --lat-sin-carga, arquitectura y riesgos condicionados al area_boost

Co-Authored-By: Claude Sonnet 5.5 <noreply@anthropic.com>
Claude-Session: https://claude.ai/code/session_01REsYNXurAR9RNVP1dufnHg
</commit_message>
<xml_diff>
--- a/entregas/viernes/REPORTE_AVANCE.docx
+++ b/entregas/viernes/REPORTE_AVANCE.docx
@@ -87,7 +87,7 @@
           <w:i w:val="0"/>
           <w:sz w:val="18"/>
         </w:rPr>
-        <w:t xml:space="preserve">    Corrida: e14_final (commit 2137cd5)</w:t>
+        <w:t xml:space="preserve">    Corrida: e16_area200 (commit 2137cd5+cambios)</w:t>
       </w:r>
     </w:p>
     <w:p>
@@ -303,7 +303,7 @@
                 <w:i w:val="0"/>
                 <w:sz w:val="19"/>
               </w:rPr>
-              <w:t>16,33</w:t>
+              <w:t>17,55</w:t>
             </w:r>
           </w:p>
         </w:tc>
@@ -427,7 +427,7 @@
                 <w:i w:val="0"/>
                 <w:sz w:val="19"/>
               </w:rPr>
-              <w:t>39,37</w:t>
+              <w:t>40,59</w:t>
             </w:r>
           </w:p>
         </w:tc>
@@ -474,21 +474,7 @@
           <w:i w:val="0"/>
           <w:sz w:val="20"/>
         </w:rPr>
-        <w:t>Cerradas 11/15 (0,733; referencia del baseline 0,905). Citación: recall ponderado 0,816 y 0 citas sin respaldo en 188 emitidas. Abstención: 0 abstenciones; 36 de 43 respondidas bien. Con 50 preguntas, una diferencia de 1–2 aciertos no es significativa.</w:t>
-      </w:r>
-    </w:p>
-    <w:p>
-      <w:pPr>
-        <w:spacing w:before="0" w:after="0" w:line="240" w:lineRule="auto"/>
-      </w:pPr>
-      <w:r>
-        <w:rPr>
-          <w:rFonts w:ascii="Calibri" w:hAnsi="Calibri" w:eastAsia="Calibri"/>
-          <w:b w:val="0"/>
-          <w:i/>
-          <w:sz w:val="17"/>
-        </w:rPr>
-        <w:t>Referencia adicional con juez RAGAS: correctness 0,502 (15,06/30); medido en e13_lookup (salida identica a e14_final).</w:t>
+        <w:t>Cerradas 11/15 (0,733; referencia del baseline 0,905). Citación: recall ponderado 0,878 y 0 citas sin respaldo en 176 emitidas. Abstención: 0 abstenciones; 36 de 43 respondidas bien. Con 50 preguntas, una diferencia de 1–2 aciertos no es significativa.</w:t>
       </w:r>
     </w:p>
     <w:p>
@@ -969,7 +955,7 @@
                 <w:i w:val="0"/>
                 <w:sz w:val="19"/>
               </w:rPr>
-              <w:t>Híbrida: BM25 (bm25s) + denso, fusión RRF (k=60), más búsqueda por referencia explícita (norma/artículo detectados con citations.py) como candidato extra; top-10 como evidencia, 5 pasajes al decoder; citas validadas contra el top-10</w:t>
+              <w:t>Híbrida: BM25 (bm25s) + denso, fusión RRF (k=60), más búsqueda por referencia explícita (norma/artículo detectados con citations.py) como candidato extra; prioridad por área del banco (factor 2,0, reordena sin filtrar); top-10 como evidencia, 5 pasajes al decoder; citas validadas contra el top-10</w:t>
             </w:r>
           </w:p>
         </w:tc>
@@ -1093,7 +1079,7 @@
           <w:i w:val="0"/>
           <w:sz w:val="20"/>
         </w:rPr>
-        <w:t>4,3 s/pregunta en la RTX 4090 cumple el objetivo (&lt;10 s), pero un Mac M1 tarda ~145 s: se congela una sola máquina y configuración para la corrida final y la verificación en vivo.</w:t>
+        <w:t>11,8 s/pregunta con la GPU compartida con otros experimentos (4,3 s sin carga, e14); el objetivo es &lt;10 s y falta medirlo en máquina dedicada. Se congela una sola máquina y configuración para la corrida final y la verificación en vivo; un Mac M1 tarda ~145 s por pregunta.</w:t>
       </w:r>
     </w:p>
     <w:p>
@@ -1107,7 +1093,7 @@
           <w:i w:val="0"/>
           <w:sz w:val="20"/>
         </w:rPr>
-        <w:t xml:space="preserve">2. Recuperación a nivel de artículo y exactitud en cerradas. </w:t>
+        <w:t xml:space="preserve">2. Recuperación a nivel de artículo, cerradas y dependencia del campo área. </w:t>
       </w:r>
       <w:r>
         <w:rPr>
@@ -1116,7 +1102,7 @@
           <w:i w:val="0"/>
           <w:sz w:val="20"/>
         </w:rPr>
-        <w:t>En muestra, art_hit@10 ≈ 0,4–0,5 y cerradas 0,733 frente a la referencia 0,905. Se prueban reranker, ajuste de la búsqueda por referencia explícita y generation_k, un cambio por experimento.</w:t>
+        <w:t>En muestra, art_hit@10 ≈ 0,4–0,6 y cerradas 0,733 frente a la referencia 0,905. La prioridad por área usa el campo «area» de la pregunta (presente en la muestra); si las 992 no lo traen, el puntaje será el de la recuperación sin ese refuerzo. Se prueban reranker y generation_k, un cambio por experimento.</w:t>
       </w:r>
     </w:p>
     <w:p>

</xml_diff>

<commit_message>
Reporte del viernes: Times New Roman, paleta verde, lenguaje claro y desbalance como limitacion
- Se quitan la observacion de no significancia y el encabezado en cursiva de la tabla 1
- Tablas y riesgos reescritos sin terminos de implementacion
- Revisado contra main (bd2c940): e16_area200 sigue siendo la ultima corrida completa

Co-Authored-By: Claude Sonnet 5.5 <noreply@anthropic.com>
Claude-Session: https://claude.ai/code/session_01REsYNXurAR9RNVP1dufnHg
</commit_message>
<xml_diff>
--- a/entregas/viernes/REPORTE_AVANCE.docx
+++ b/entregas/viernes/REPORTE_AVANCE.docx
@@ -8,10 +8,10 @@
       </w:pPr>
       <w:r>
         <w:rPr>
-          <w:rFonts w:ascii="Calibri" w:hAnsi="Calibri" w:eastAsia="Calibri"/>
+          <w:rFonts w:ascii="Times New Roman" w:hAnsi="Times New Roman" w:eastAsia="Times New Roman"/>
           <w:b/>
           <w:i w:val="0"/>
-          <w:color w:val="1F3A5F"/>
+          <w:color w:val="1E5B3A"/>
           <w:sz w:val="32"/>
         </w:rPr>
         <w:t>Reporte de avance — Hackathon 2026</w:t>
@@ -23,7 +23,7 @@
       </w:pPr>
       <w:r>
         <w:rPr>
-          <w:rFonts w:ascii="Calibri" w:hAnsi="Calibri" w:eastAsia="Calibri"/>
+          <w:rFonts w:ascii="Times New Roman" w:hAnsi="Times New Roman" w:eastAsia="Times New Roman"/>
           <w:b/>
           <w:i w:val="0"/>
           <w:sz w:val="20"/>
@@ -32,7 +32,7 @@
       </w:r>
       <w:r>
         <w:rPr>
-          <w:rFonts w:ascii="Calibri" w:hAnsi="Calibri" w:eastAsia="Calibri"/>
+          <w:rFonts w:ascii="Times New Roman" w:hAnsi="Times New Roman" w:eastAsia="Times New Roman"/>
           <w:b w:val="0"/>
           <w:i w:val="0"/>
           <w:sz w:val="20"/>
@@ -41,7 +41,7 @@
       </w:r>
       <w:r>
         <w:rPr>
-          <w:rFonts w:ascii="Calibri" w:hAnsi="Calibri" w:eastAsia="Calibri"/>
+          <w:rFonts w:ascii="Times New Roman" w:hAnsi="Times New Roman" w:eastAsia="Times New Roman"/>
           <w:b/>
           <w:i w:val="0"/>
           <w:sz w:val="20"/>
@@ -50,7 +50,7 @@
       </w:r>
       <w:r>
         <w:rPr>
-          <w:rFonts w:ascii="Calibri" w:hAnsi="Calibri" w:eastAsia="Calibri"/>
+          <w:rFonts w:ascii="Times New Roman" w:hAnsi="Times New Roman" w:eastAsia="Times New Roman"/>
           <w:b w:val="0"/>
           <w:i w:val="0"/>
           <w:sz w:val="20"/>
@@ -64,7 +64,7 @@
       </w:pPr>
       <w:r>
         <w:rPr>
-          <w:rFonts w:ascii="Calibri" w:hAnsi="Calibri" w:eastAsia="Calibri"/>
+          <w:rFonts w:ascii="Times New Roman" w:hAnsi="Times New Roman" w:eastAsia="Times New Roman"/>
           <w:b/>
           <w:i w:val="0"/>
           <w:sz w:val="18"/>
@@ -73,7 +73,7 @@
       </w:r>
       <w:r>
         <w:rPr>
-          <w:rFonts w:ascii="Calibri" w:hAnsi="Calibri" w:eastAsia="Calibri"/>
+          <w:rFonts w:ascii="Times New Roman" w:hAnsi="Times New Roman" w:eastAsia="Times New Roman"/>
           <w:b w:val="0"/>
           <w:i w:val="0"/>
           <w:sz w:val="18"/>
@@ -82,7 +82,7 @@
       </w:r>
       <w:r>
         <w:rPr>
-          <w:rFonts w:ascii="Calibri" w:hAnsi="Calibri" w:eastAsia="Calibri"/>
+          <w:rFonts w:ascii="Times New Roman" w:hAnsi="Times New Roman" w:eastAsia="Times New Roman"/>
           <w:b w:val="0"/>
           <w:i w:val="0"/>
           <w:sz w:val="18"/>
@@ -94,32 +94,18 @@
       <w:pPr>
         <w:spacing w:before="140" w:after="40" w:line="240" w:lineRule="auto"/>
         <w:pBdr>
-          <w:bottom w:val="single" w:sz="6" w:space="1" w:color="1F3A5F"/>
+          <w:bottom w:val="single" w:sz="6" w:space="1" w:color="1E5B3A"/>
         </w:pBdr>
       </w:pPr>
       <w:r>
         <w:rPr>
-          <w:rFonts w:ascii="Calibri" w:hAnsi="Calibri" w:eastAsia="Calibri"/>
+          <w:rFonts w:ascii="Times New Roman" w:hAnsi="Times New Roman" w:eastAsia="Times New Roman"/>
           <w:b/>
           <w:i w:val="0"/>
-          <w:color w:val="1F3A5F"/>
+          <w:color w:val="1E5B3A"/>
           <w:sz w:val="22"/>
         </w:rPr>
         <w:t>1. Puntaje sobre las preguntas de muestra</w:t>
-      </w:r>
-    </w:p>
-    <w:p>
-      <w:pPr>
-        <w:spacing w:before="0" w:after="40" w:line="240" w:lineRule="auto"/>
-      </w:pPr>
-      <w:r>
-        <w:rPr>
-          <w:rFonts w:ascii="Calibri" w:hAnsi="Calibri" w:eastAsia="Calibri"/>
-          <w:b w:val="0"/>
-          <w:i/>
-          <w:sz w:val="17"/>
-        </w:rPr>
-        <w:t>Resultado de python scripts/evaluate.py --submission &lt;archivo&gt; --split sample.</w:t>
       </w:r>
     </w:p>
     <w:tbl>
@@ -129,9 +115,9 @@
         <w:tblLayout w:type="fixed"/>
         <w:tblLook w:firstColumn="1" w:firstRow="1" w:lastColumn="0" w:lastRow="0" w:noHBand="0" w:noVBand="1" w:val="04A0"/>
         <w:tblBorders>
-          <w:top w:val="single" w:sz="4" w:space="0" w:color="B8C0CC"/>
-          <w:bottom w:val="single" w:sz="4" w:space="0" w:color="B8C0CC"/>
-          <w:insideH w:val="single" w:sz="4" w:space="0" w:color="B8C0CC"/>
+          <w:top w:val="single" w:sz="4" w:space="0" w:color="9DBBA6"/>
+          <w:bottom w:val="single" w:sz="4" w:space="0" w:color="9DBBA6"/>
+          <w:insideH w:val="single" w:sz="4" w:space="0" w:color="9DBBA6"/>
         </w:tblBorders>
       </w:tblPr>
       <w:tblGrid>
@@ -143,7 +129,7 @@
         <w:tc>
           <w:tcPr>
             <w:tcW w:type="dxa" w:w="4535"/>
-            <w:shd w:val="clear" w:color="auto" w:fill="EEF1F5"/>
+            <w:shd w:val="clear" w:color="auto" w:fill="E4F0E7"/>
           </w:tcPr>
           <w:p>
             <w:pPr>
@@ -151,10 +137,10 @@
             </w:pPr>
             <w:r>
               <w:rPr>
-                <w:rFonts w:ascii="Calibri" w:hAnsi="Calibri" w:eastAsia="Calibri"/>
+                <w:rFonts w:ascii="Times New Roman" w:hAnsi="Times New Roman" w:eastAsia="Times New Roman"/>
                 <w:b/>
                 <w:i w:val="0"/>
-                <w:color w:val="1F3A5F"/>
+                <w:color w:val="1E5B3A"/>
                 <w:sz w:val="19"/>
               </w:rPr>
               <w:t>Componente</w:t>
@@ -164,7 +150,7 @@
         <w:tc>
           <w:tcPr>
             <w:tcW w:type="dxa" w:w="2551"/>
-            <w:shd w:val="clear" w:color="auto" w:fill="EEF1F5"/>
+            <w:shd w:val="clear" w:color="auto" w:fill="E4F0E7"/>
           </w:tcPr>
           <w:p>
             <w:pPr>
@@ -173,10 +159,10 @@
             </w:pPr>
             <w:r>
               <w:rPr>
-                <w:rFonts w:ascii="Calibri" w:hAnsi="Calibri" w:eastAsia="Calibri"/>
+                <w:rFonts w:ascii="Times New Roman" w:hAnsi="Times New Roman" w:eastAsia="Times New Roman"/>
                 <w:b/>
                 <w:i w:val="0"/>
-                <w:color w:val="1F3A5F"/>
+                <w:color w:val="1E5B3A"/>
                 <w:sz w:val="19"/>
               </w:rPr>
               <w:t>Puntos obtenidos</w:t>
@@ -186,7 +172,7 @@
         <w:tc>
           <w:tcPr>
             <w:tcW w:type="dxa" w:w="2551"/>
-            <w:shd w:val="clear" w:color="auto" w:fill="EEF1F5"/>
+            <w:shd w:val="clear" w:color="auto" w:fill="E4F0E7"/>
           </w:tcPr>
           <w:p>
             <w:pPr>
@@ -195,10 +181,10 @@
             </w:pPr>
             <w:r>
               <w:rPr>
-                <w:rFonts w:ascii="Calibri" w:hAnsi="Calibri" w:eastAsia="Calibri"/>
+                <w:rFonts w:ascii="Times New Roman" w:hAnsi="Times New Roman" w:eastAsia="Times New Roman"/>
                 <w:b/>
                 <w:i w:val="0"/>
-                <w:color w:val="1F3A5F"/>
+                <w:color w:val="1E5B3A"/>
                 <w:sz w:val="19"/>
               </w:rPr>
               <w:t>Puntos posibles</w:t>
@@ -217,7 +203,7 @@
             </w:pPr>
             <w:r>
               <w:rPr>
-                <w:rFonts w:ascii="Calibri" w:hAnsi="Calibri" w:eastAsia="Calibri"/>
+                <w:rFonts w:ascii="Times New Roman" w:hAnsi="Times New Roman" w:eastAsia="Times New Roman"/>
                 <w:b w:val="0"/>
                 <w:i w:val="0"/>
                 <w:sz w:val="19"/>
@@ -237,7 +223,7 @@
             </w:pPr>
             <w:r>
               <w:rPr>
-                <w:rFonts w:ascii="Calibri" w:hAnsi="Calibri" w:eastAsia="Calibri"/>
+                <w:rFonts w:ascii="Times New Roman" w:hAnsi="Times New Roman" w:eastAsia="Times New Roman"/>
                 <w:b w:val="0"/>
                 <w:i w:val="0"/>
                 <w:sz w:val="19"/>
@@ -257,7 +243,7 @@
             </w:pPr>
             <w:r>
               <w:rPr>
-                <w:rFonts w:ascii="Calibri" w:hAnsi="Calibri" w:eastAsia="Calibri"/>
+                <w:rFonts w:ascii="Times New Roman" w:hAnsi="Times New Roman" w:eastAsia="Times New Roman"/>
                 <w:b w:val="0"/>
                 <w:i w:val="0"/>
                 <w:sz w:val="19"/>
@@ -278,7 +264,7 @@
             </w:pPr>
             <w:r>
               <w:rPr>
-                <w:rFonts w:ascii="Calibri" w:hAnsi="Calibri" w:eastAsia="Calibri"/>
+                <w:rFonts w:ascii="Times New Roman" w:hAnsi="Times New Roman" w:eastAsia="Times New Roman"/>
                 <w:b w:val="0"/>
                 <w:i w:val="0"/>
                 <w:sz w:val="19"/>
@@ -298,7 +284,7 @@
             </w:pPr>
             <w:r>
               <w:rPr>
-                <w:rFonts w:ascii="Calibri" w:hAnsi="Calibri" w:eastAsia="Calibri"/>
+                <w:rFonts w:ascii="Times New Roman" w:hAnsi="Times New Roman" w:eastAsia="Times New Roman"/>
                 <w:b w:val="0"/>
                 <w:i w:val="0"/>
                 <w:sz w:val="19"/>
@@ -318,7 +304,7 @@
             </w:pPr>
             <w:r>
               <w:rPr>
-                <w:rFonts w:ascii="Calibri" w:hAnsi="Calibri" w:eastAsia="Calibri"/>
+                <w:rFonts w:ascii="Times New Roman" w:hAnsi="Times New Roman" w:eastAsia="Times New Roman"/>
                 <w:b w:val="0"/>
                 <w:i w:val="0"/>
                 <w:sz w:val="19"/>
@@ -339,7 +325,7 @@
             </w:pPr>
             <w:r>
               <w:rPr>
-                <w:rFonts w:ascii="Calibri" w:hAnsi="Calibri" w:eastAsia="Calibri"/>
+                <w:rFonts w:ascii="Times New Roman" w:hAnsi="Times New Roman" w:eastAsia="Times New Roman"/>
                 <w:b w:val="0"/>
                 <w:i w:val="0"/>
                 <w:sz w:val="19"/>
@@ -359,7 +345,7 @@
             </w:pPr>
             <w:r>
               <w:rPr>
-                <w:rFonts w:ascii="Calibri" w:hAnsi="Calibri" w:eastAsia="Calibri"/>
+                <w:rFonts w:ascii="Times New Roman" w:hAnsi="Times New Roman" w:eastAsia="Times New Roman"/>
                 <w:b w:val="0"/>
                 <w:i w:val="0"/>
                 <w:sz w:val="19"/>
@@ -379,7 +365,7 @@
             </w:pPr>
             <w:r>
               <w:rPr>
-                <w:rFonts w:ascii="Calibri" w:hAnsi="Calibri" w:eastAsia="Calibri"/>
+                <w:rFonts w:ascii="Times New Roman" w:hAnsi="Times New Roman" w:eastAsia="Times New Roman"/>
                 <w:b w:val="0"/>
                 <w:i w:val="0"/>
                 <w:sz w:val="19"/>
@@ -393,7 +379,7 @@
         <w:tc>
           <w:tcPr>
             <w:tcW w:type="dxa" w:w="4535"/>
-            <w:shd w:val="clear" w:color="auto" w:fill="EEF1F5"/>
+            <w:shd w:val="clear" w:color="auto" w:fill="E4F0E7"/>
           </w:tcPr>
           <w:p>
             <w:pPr>
@@ -401,7 +387,7 @@
             </w:pPr>
             <w:r>
               <w:rPr>
-                <w:rFonts w:ascii="Calibri" w:hAnsi="Calibri" w:eastAsia="Calibri"/>
+                <w:rFonts w:ascii="Times New Roman" w:hAnsi="Times New Roman" w:eastAsia="Times New Roman"/>
                 <w:b/>
                 <w:i w:val="0"/>
                 <w:sz w:val="19"/>
@@ -413,7 +399,7 @@
         <w:tc>
           <w:tcPr>
             <w:tcW w:type="dxa" w:w="2551"/>
-            <w:shd w:val="clear" w:color="auto" w:fill="EEF1F5"/>
+            <w:shd w:val="clear" w:color="auto" w:fill="E4F0E7"/>
           </w:tcPr>
           <w:p>
             <w:pPr>
@@ -422,7 +408,7 @@
             </w:pPr>
             <w:r>
               <w:rPr>
-                <w:rFonts w:ascii="Calibri" w:hAnsi="Calibri" w:eastAsia="Calibri"/>
+                <w:rFonts w:ascii="Times New Roman" w:hAnsi="Times New Roman" w:eastAsia="Times New Roman"/>
                 <w:b/>
                 <w:i w:val="0"/>
                 <w:sz w:val="19"/>
@@ -434,7 +420,7 @@
         <w:tc>
           <w:tcPr>
             <w:tcW w:type="dxa" w:w="2551"/>
-            <w:shd w:val="clear" w:color="auto" w:fill="EEF1F5"/>
+            <w:shd w:val="clear" w:color="auto" w:fill="E4F0E7"/>
           </w:tcPr>
           <w:p>
             <w:pPr>
@@ -443,7 +429,7 @@
             </w:pPr>
             <w:r>
               <w:rPr>
-                <w:rFonts w:ascii="Calibri" w:hAnsi="Calibri" w:eastAsia="Calibri"/>
+                <w:rFonts w:ascii="Times New Roman" w:hAnsi="Times New Roman" w:eastAsia="Times New Roman"/>
                 <w:b/>
                 <w:i w:val="0"/>
                 <w:sz w:val="19"/>
@@ -460,7 +446,7 @@
       </w:pPr>
       <w:r>
         <w:rPr>
-          <w:rFonts w:ascii="Calibri" w:hAnsi="Calibri" w:eastAsia="Calibri"/>
+          <w:rFonts w:ascii="Times New Roman" w:hAnsi="Times New Roman" w:eastAsia="Times New Roman"/>
           <w:b/>
           <w:i w:val="0"/>
           <w:sz w:val="20"/>
@@ -469,27 +455,36 @@
       </w:r>
       <w:r>
         <w:rPr>
-          <w:rFonts w:ascii="Calibri" w:hAnsi="Calibri" w:eastAsia="Calibri"/>
+          <w:rFonts w:ascii="Times New Roman" w:hAnsi="Times New Roman" w:eastAsia="Times New Roman"/>
           <w:b w:val="0"/>
           <w:i w:val="0"/>
           <w:sz w:val="20"/>
         </w:rPr>
-        <w:t>Cerradas 11/15 (0,733; referencia del baseline 0,905). Citación: recall ponderado 0,878 y 0 citas sin respaldo en 176 emitidas. Abstención: 0 abstenciones; 36 de 43 respondidas bien. Con 50 preguntas, una diferencia de 1–2 aciertos no es significativa.</w:t>
+        <w:t xml:space="preserve">Preguntas cerradas: 11 de 15 correctas (la referencia es 0,905). Citación: ninguna de las 176 citas emitidas carece de respaldo en los textos recuperados. </w:t>
+      </w:r>
+      <w:r>
+        <w:rPr>
+          <w:rFonts w:ascii="Times New Roman" w:hAnsi="Times New Roman" w:eastAsia="Times New Roman"/>
+          <w:b w:val="0"/>
+          <w:i w:val="0"/>
+          <w:sz w:val="20"/>
+        </w:rPr>
+        <w:t>Abstención: 0 abstenciones; 36 de 43 preguntas respondidas bien.</w:t>
       </w:r>
     </w:p>
     <w:p>
       <w:pPr>
         <w:spacing w:before="140" w:after="40" w:line="240" w:lineRule="auto"/>
         <w:pBdr>
-          <w:bottom w:val="single" w:sz="6" w:space="1" w:color="1F3A5F"/>
+          <w:bottom w:val="single" w:sz="6" w:space="1" w:color="1E5B3A"/>
         </w:pBdr>
       </w:pPr>
       <w:r>
         <w:rPr>
-          <w:rFonts w:ascii="Calibri" w:hAnsi="Calibri" w:eastAsia="Calibri"/>
+          <w:rFonts w:ascii="Times New Roman" w:hAnsi="Times New Roman" w:eastAsia="Times New Roman"/>
           <w:b/>
           <w:i w:val="0"/>
-          <w:color w:val="1F3A5F"/>
+          <w:color w:val="1E5B3A"/>
           <w:sz w:val="22"/>
         </w:rPr>
         <w:t>2. Estado del corpus</w:t>
@@ -502,9 +497,9 @@
         <w:tblLayout w:type="fixed"/>
         <w:tblLook w:firstColumn="1" w:firstRow="1" w:lastColumn="0" w:lastRow="0" w:noHBand="0" w:noVBand="1" w:val="04A0"/>
         <w:tblBorders>
-          <w:top w:val="single" w:sz="4" w:space="0" w:color="B8C0CC"/>
-          <w:bottom w:val="single" w:sz="4" w:space="0" w:color="B8C0CC"/>
-          <w:insideH w:val="single" w:sz="4" w:space="0" w:color="B8C0CC"/>
+          <w:top w:val="single" w:sz="4" w:space="0" w:color="9DBBA6"/>
+          <w:bottom w:val="single" w:sz="4" w:space="0" w:color="9DBBA6"/>
+          <w:insideH w:val="single" w:sz="4" w:space="0" w:color="9DBBA6"/>
         </w:tblBorders>
       </w:tblPr>
       <w:tblGrid>
@@ -515,7 +510,7 @@
         <w:tc>
           <w:tcPr>
             <w:tcW w:type="dxa" w:w="4535"/>
-            <w:shd w:val="clear" w:color="auto" w:fill="EEF1F5"/>
+            <w:shd w:val="clear" w:color="auto" w:fill="E4F0E7"/>
           </w:tcPr>
           <w:p>
             <w:pPr>
@@ -523,10 +518,10 @@
             </w:pPr>
             <w:r>
               <w:rPr>
-                <w:rFonts w:ascii="Calibri" w:hAnsi="Calibri" w:eastAsia="Calibri"/>
+                <w:rFonts w:ascii="Times New Roman" w:hAnsi="Times New Roman" w:eastAsia="Times New Roman"/>
                 <w:b/>
                 <w:i w:val="0"/>
-                <w:color w:val="1F3A5F"/>
+                <w:color w:val="1E5B3A"/>
                 <w:sz w:val="19"/>
               </w:rPr>
               <w:t>Métrica</w:t>
@@ -536,7 +531,7 @@
         <w:tc>
           <w:tcPr>
             <w:tcW w:type="dxa" w:w="5102"/>
-            <w:shd w:val="clear" w:color="auto" w:fill="EEF1F5"/>
+            <w:shd w:val="clear" w:color="auto" w:fill="E4F0E7"/>
           </w:tcPr>
           <w:p>
             <w:pPr>
@@ -544,10 +539,10 @@
             </w:pPr>
             <w:r>
               <w:rPr>
-                <w:rFonts w:ascii="Calibri" w:hAnsi="Calibri" w:eastAsia="Calibri"/>
+                <w:rFonts w:ascii="Times New Roman" w:hAnsi="Times New Roman" w:eastAsia="Times New Roman"/>
                 <w:b/>
                 <w:i w:val="0"/>
-                <w:color w:val="1F3A5F"/>
+                <w:color w:val="1E5B3A"/>
                 <w:sz w:val="19"/>
               </w:rPr>
               <w:t>Valor</w:t>
@@ -566,7 +561,7 @@
             </w:pPr>
             <w:r>
               <w:rPr>
-                <w:rFonts w:ascii="Calibri" w:hAnsi="Calibri" w:eastAsia="Calibri"/>
+                <w:rFonts w:ascii="Times New Roman" w:hAnsi="Times New Roman" w:eastAsia="Times New Roman"/>
                 <w:b w:val="0"/>
                 <w:i w:val="0"/>
                 <w:sz w:val="19"/>
@@ -585,7 +580,7 @@
             </w:pPr>
             <w:r>
               <w:rPr>
-                <w:rFonts w:ascii="Calibri" w:hAnsi="Calibri" w:eastAsia="Calibri"/>
+                <w:rFonts w:ascii="Times New Roman" w:hAnsi="Times New Roman" w:eastAsia="Times New Roman"/>
                 <w:b w:val="0"/>
                 <w:i w:val="0"/>
                 <w:sz w:val="19"/>
@@ -606,7 +601,7 @@
             </w:pPr>
             <w:r>
               <w:rPr>
-                <w:rFonts w:ascii="Calibri" w:hAnsi="Calibri" w:eastAsia="Calibri"/>
+                <w:rFonts w:ascii="Times New Roman" w:hAnsi="Times New Roman" w:eastAsia="Times New Roman"/>
                 <w:b w:val="0"/>
                 <w:i w:val="0"/>
                 <w:sz w:val="19"/>
@@ -625,7 +620,7 @@
             </w:pPr>
             <w:r>
               <w:rPr>
-                <w:rFonts w:ascii="Calibri" w:hAnsi="Calibri" w:eastAsia="Calibri"/>
+                <w:rFonts w:ascii="Times New Roman" w:hAnsi="Times New Roman" w:eastAsia="Times New Roman"/>
                 <w:b w:val="0"/>
                 <w:i w:val="0"/>
                 <w:sz w:val="19"/>
@@ -646,7 +641,7 @@
             </w:pPr>
             <w:r>
               <w:rPr>
-                <w:rFonts w:ascii="Calibri" w:hAnsi="Calibri" w:eastAsia="Calibri"/>
+                <w:rFonts w:ascii="Times New Roman" w:hAnsi="Times New Roman" w:eastAsia="Times New Roman"/>
                 <w:b w:val="0"/>
                 <w:i w:val="0"/>
                 <w:sz w:val="19"/>
@@ -665,7 +660,7 @@
             </w:pPr>
             <w:r>
               <w:rPr>
-                <w:rFonts w:ascii="Calibri" w:hAnsi="Calibri" w:eastAsia="Calibri"/>
+                <w:rFonts w:ascii="Times New Roman" w:hAnsi="Times New Roman" w:eastAsia="Times New Roman"/>
                 <w:b w:val="0"/>
                 <w:i w:val="0"/>
                 <w:sz w:val="19"/>
@@ -686,7 +681,7 @@
             </w:pPr>
             <w:r>
               <w:rPr>
-                <w:rFonts w:ascii="Calibri" w:hAnsi="Calibri" w:eastAsia="Calibri"/>
+                <w:rFonts w:ascii="Times New Roman" w:hAnsi="Times New Roman" w:eastAsia="Times New Roman"/>
                 <w:b w:val="0"/>
                 <w:i w:val="0"/>
                 <w:sz w:val="19"/>
@@ -705,7 +700,7 @@
             </w:pPr>
             <w:r>
               <w:rPr>
-                <w:rFonts w:ascii="Calibri" w:hAnsi="Calibri" w:eastAsia="Calibri"/>
+                <w:rFonts w:ascii="Times New Roman" w:hAnsi="Times New Roman" w:eastAsia="Times New Roman"/>
                 <w:b w:val="0"/>
                 <w:i w:val="0"/>
                 <w:sz w:val="19"/>
@@ -722,7 +717,7 @@
       </w:pPr>
       <w:r>
         <w:rPr>
-          <w:rFonts w:ascii="Calibri" w:hAnsi="Calibri" w:eastAsia="Calibri"/>
+          <w:rFonts w:ascii="Times New Roman" w:hAnsi="Times New Roman" w:eastAsia="Times New Roman"/>
           <w:b/>
           <w:i w:val="0"/>
           <w:sz w:val="20"/>
@@ -731,7 +726,7 @@
       </w:r>
       <w:r>
         <w:rPr>
-          <w:rFonts w:ascii="Calibri" w:hAnsi="Calibri" w:eastAsia="Calibri"/>
+          <w:rFonts w:ascii="Times New Roman" w:hAnsi="Times New Roman" w:eastAsia="Times New Roman"/>
           <w:b w:val="0"/>
           <w:i w:val="0"/>
           <w:sz w:val="20"/>
@@ -745,7 +740,7 @@
       </w:pPr>
       <w:r>
         <w:rPr>
-          <w:rFonts w:ascii="Calibri" w:hAnsi="Calibri" w:eastAsia="Calibri"/>
+          <w:rFonts w:ascii="Times New Roman" w:hAnsi="Times New Roman" w:eastAsia="Times New Roman"/>
           <w:b/>
           <w:i w:val="0"/>
           <w:sz w:val="20"/>
@@ -754,27 +749,27 @@
       </w:r>
       <w:r>
         <w:rPr>
-          <w:rFonts w:ascii="Calibri" w:hAnsi="Calibri" w:eastAsia="Calibri"/>
+          <w:rFonts w:ascii="Times New Roman" w:hAnsi="Times New Roman" w:eastAsia="Times New Roman"/>
           <w:b w:val="0"/>
           <w:i w:val="0"/>
           <w:sz w:val="20"/>
         </w:rPr>
-        <w:t>(un documento puede tener varias): constitucional 340, laboral 56, de familia 49, penal 45, administrativo 40, comercial y sociedades 36, civil 35, tributario 31, procesal 28, mercados 25. El corpus tiene desbalance hacia constitucional (sentencias de la Corte); las áreas de 30 documentos adicionales son provisionales.</w:t>
+        <w:t>(un documento puede pertenecer a varias): constitucional 340, laboral 56, de familia 49, penal 45, administrativo 40, comercial y sociedades 36, civil 35, tributario 31, procesal 28, mercados 25.</w:t>
       </w:r>
     </w:p>
     <w:p>
       <w:pPr>
         <w:spacing w:before="140" w:after="40" w:line="240" w:lineRule="auto"/>
         <w:pBdr>
-          <w:bottom w:val="single" w:sz="6" w:space="1" w:color="1F3A5F"/>
+          <w:bottom w:val="single" w:sz="6" w:space="1" w:color="1E5B3A"/>
         </w:pBdr>
       </w:pPr>
       <w:r>
         <w:rPr>
-          <w:rFonts w:ascii="Calibri" w:hAnsi="Calibri" w:eastAsia="Calibri"/>
+          <w:rFonts w:ascii="Times New Roman" w:hAnsi="Times New Roman" w:eastAsia="Times New Roman"/>
           <w:b/>
           <w:i w:val="0"/>
-          <w:color w:val="1F3A5F"/>
+          <w:color w:val="1E5B3A"/>
           <w:sz w:val="22"/>
         </w:rPr>
         <w:t>3. Arquitectura actual</w:t>
@@ -787,9 +782,9 @@
         <w:tblLayout w:type="fixed"/>
         <w:tblLook w:firstColumn="1" w:firstRow="1" w:lastColumn="0" w:lastRow="0" w:noHBand="0" w:noVBand="1" w:val="04A0"/>
         <w:tblBorders>
-          <w:top w:val="single" w:sz="4" w:space="0" w:color="B8C0CC"/>
-          <w:bottom w:val="single" w:sz="4" w:space="0" w:color="B8C0CC"/>
-          <w:insideH w:val="single" w:sz="4" w:space="0" w:color="B8C0CC"/>
+          <w:top w:val="single" w:sz="4" w:space="0" w:color="9DBBA6"/>
+          <w:bottom w:val="single" w:sz="4" w:space="0" w:color="9DBBA6"/>
+          <w:insideH w:val="single" w:sz="4" w:space="0" w:color="9DBBA6"/>
         </w:tblBorders>
       </w:tblPr>
       <w:tblGrid>
@@ -800,7 +795,7 @@
         <w:tc>
           <w:tcPr>
             <w:tcW w:type="dxa" w:w="2608"/>
-            <w:shd w:val="clear" w:color="auto" w:fill="EEF1F5"/>
+            <w:shd w:val="clear" w:color="auto" w:fill="E4F0E7"/>
           </w:tcPr>
           <w:p>
             <w:pPr>
@@ -808,10 +803,10 @@
             </w:pPr>
             <w:r>
               <w:rPr>
-                <w:rFonts w:ascii="Calibri" w:hAnsi="Calibri" w:eastAsia="Calibri"/>
+                <w:rFonts w:ascii="Times New Roman" w:hAnsi="Times New Roman" w:eastAsia="Times New Roman"/>
                 <w:b/>
                 <w:i w:val="0"/>
-                <w:color w:val="1F3A5F"/>
+                <w:color w:val="1E5B3A"/>
                 <w:sz w:val="19"/>
               </w:rPr>
               <w:t>Componente</w:t>
@@ -821,7 +816,7 @@
         <w:tc>
           <w:tcPr>
             <w:tcW w:type="dxa" w:w="7030"/>
-            <w:shd w:val="clear" w:color="auto" w:fill="EEF1F5"/>
+            <w:shd w:val="clear" w:color="auto" w:fill="E4F0E7"/>
           </w:tcPr>
           <w:p>
             <w:pPr>
@@ -829,10 +824,10 @@
             </w:pPr>
             <w:r>
               <w:rPr>
-                <w:rFonts w:ascii="Calibri" w:hAnsi="Calibri" w:eastAsia="Calibri"/>
+                <w:rFonts w:ascii="Times New Roman" w:hAnsi="Times New Roman" w:eastAsia="Times New Roman"/>
                 <w:b/>
                 <w:i w:val="0"/>
-                <w:color w:val="1F3A5F"/>
+                <w:color w:val="1E5B3A"/>
                 <w:sz w:val="19"/>
               </w:rPr>
               <w:t>Elección</w:t>
@@ -851,12 +846,12 @@
             </w:pPr>
             <w:r>
               <w:rPr>
-                <w:rFonts w:ascii="Calibri" w:hAnsi="Calibri" w:eastAsia="Calibri"/>
+                <w:rFonts w:ascii="Times New Roman" w:hAnsi="Times New Roman" w:eastAsia="Times New Roman"/>
                 <w:b w:val="0"/>
                 <w:i w:val="0"/>
                 <w:sz w:val="19"/>
               </w:rPr>
-              <w:t>Encoder</w:t>
+              <w:t>Encoder (convierte textos en vectores para comparar significado)</w:t>
             </w:r>
           </w:p>
         </w:tc>
@@ -870,12 +865,12 @@
             </w:pPr>
             <w:r>
               <w:rPr>
-                <w:rFonts w:ascii="Calibri" w:hAnsi="Calibri" w:eastAsia="Calibri"/>
+                <w:rFonts w:ascii="Times New Roman" w:hAnsi="Times New Roman" w:eastAsia="Times New Roman"/>
                 <w:b w:val="0"/>
                 <w:i w:val="0"/>
                 <w:sz w:val="19"/>
               </w:rPr>
-              <w:t>BAAI/bge-m3 (fp32, FAISS IndexFlatIP, vectores normalizados)</w:t>
+              <w:t>BAAI/bge-m3, modelo multilingüe de código abierto</w:t>
             </w:r>
           </w:p>
         </w:tc>
@@ -891,12 +886,12 @@
             </w:pPr>
             <w:r>
               <w:rPr>
-                <w:rFonts w:ascii="Calibri" w:hAnsi="Calibri" w:eastAsia="Calibri"/>
+                <w:rFonts w:ascii="Times New Roman" w:hAnsi="Times New Roman" w:eastAsia="Times New Roman"/>
                 <w:b w:val="0"/>
                 <w:i w:val="0"/>
                 <w:sz w:val="19"/>
               </w:rPr>
-              <w:t>Decoder</w:t>
+              <w:t>Decoder (redacta la respuesta)</w:t>
             </w:r>
           </w:p>
         </w:tc>
@@ -910,12 +905,12 @@
             </w:pPr>
             <w:r>
               <w:rPr>
-                <w:rFonts w:ascii="Calibri" w:hAnsi="Calibri" w:eastAsia="Calibri"/>
+                <w:rFonts w:ascii="Times New Roman" w:hAnsi="Times New Roman" w:eastAsia="Times New Roman"/>
                 <w:b w:val="0"/>
                 <w:i w:val="0"/>
                 <w:sz w:val="19"/>
               </w:rPr>
-              <w:t>Qwen3-8B, cuantización Q8_0 con llama.cpp; temperature=0, seed=0, salida restringida por JSON Schema</w:t>
+              <w:t>Qwen3-8B (8.000 millones de parámetros), ejecutado localmente; da siempre la misma respuesta ante la misma pregunta y su salida sigue un formato fijo</w:t>
             </w:r>
           </w:p>
         </w:tc>
@@ -931,7 +926,7 @@
             </w:pPr>
             <w:r>
               <w:rPr>
-                <w:rFonts w:ascii="Calibri" w:hAnsi="Calibri" w:eastAsia="Calibri"/>
+                <w:rFonts w:ascii="Times New Roman" w:hAnsi="Times New Roman" w:eastAsia="Times New Roman"/>
                 <w:b w:val="0"/>
                 <w:i w:val="0"/>
                 <w:sz w:val="19"/>
@@ -950,12 +945,12 @@
             </w:pPr>
             <w:r>
               <w:rPr>
-                <w:rFonts w:ascii="Calibri" w:hAnsi="Calibri" w:eastAsia="Calibri"/>
+                <w:rFonts w:ascii="Times New Roman" w:hAnsi="Times New Roman" w:eastAsia="Times New Roman"/>
                 <w:b w:val="0"/>
                 <w:i w:val="0"/>
                 <w:sz w:val="19"/>
               </w:rPr>
-              <w:t>Híbrida: BM25 (bm25s) + denso, fusión RRF (k=60), más búsqueda por referencia explícita (norma/artículo detectados con citations.py) como candidato extra; prioridad por área del banco (factor 2,0, reordena sin filtrar); top-10 como evidencia, 5 pasajes al decoder; citas validadas contra el top-10</w:t>
+              <w:t>Combina dos búsquedas: por palabras exactas (útil para números de artículo y siglas) y por significado, y fusiona sus resultados; si la pregunta nombra una norma y un artículo, ese artículo se añade como candidato; se da prioridad a los documentos del área de la pregunta. Se recuperan 10 textos como evidencia y 5 se entregan al decoder; toda cita debe provenir de esos 10 textos</w:t>
             </w:r>
           </w:p>
         </w:tc>
@@ -971,7 +966,7 @@
             </w:pPr>
             <w:r>
               <w:rPr>
-                <w:rFonts w:ascii="Calibri" w:hAnsi="Calibri" w:eastAsia="Calibri"/>
+                <w:rFonts w:ascii="Times New Roman" w:hAnsi="Times New Roman" w:eastAsia="Times New Roman"/>
                 <w:b w:val="0"/>
                 <w:i w:val="0"/>
                 <w:sz w:val="19"/>
@@ -990,12 +985,12 @@
             </w:pPr>
             <w:r>
               <w:rPr>
-                <w:rFonts w:ascii="Calibri" w:hAnsi="Calibri" w:eastAsia="Calibri"/>
+                <w:rFonts w:ascii="Times New Roman" w:hAnsi="Times New Roman" w:eastAsia="Times New Roman"/>
                 <w:b w:val="0"/>
                 <w:i w:val="0"/>
                 <w:sz w:val="19"/>
               </w:rPr>
-              <w:t>seg-v1: un artículo = un fragmento (≤350 palabras, partido por párrafos); sentencias en ventanas de ~350 palabras por sección</w:t>
+              <w:t>Cada artículo de una norma es un fragmento (si es muy largo se divide por párrafos); las sentencias se dividen en tramos de unas 350 palabras, sin mezclar secciones</w:t>
             </w:r>
           </w:p>
         </w:tc>
@@ -1011,7 +1006,7 @@
             </w:pPr>
             <w:r>
               <w:rPr>
-                <w:rFonts w:ascii="Calibri" w:hAnsi="Calibri" w:eastAsia="Calibri"/>
+                <w:rFonts w:ascii="Times New Roman" w:hAnsi="Times New Roman" w:eastAsia="Times New Roman"/>
                 <w:b w:val="0"/>
                 <w:i w:val="0"/>
                 <w:sz w:val="19"/>
@@ -1030,12 +1025,12 @@
             </w:pPr>
             <w:r>
               <w:rPr>
-                <w:rFonts w:ascii="Calibri" w:hAnsi="Calibri" w:eastAsia="Calibri"/>
+                <w:rFonts w:ascii="Times New Roman" w:hAnsi="Times New Roman" w:eastAsia="Times New Roman"/>
                 <w:b w:val="0"/>
                 <w:i w:val="0"/>
                 <w:sz w:val="19"/>
               </w:rPr>
-              <w:t>Validación de citas contra el top-10; si quedan campos vacíos tras regenerar, se abstiene. Regla por señales (score, margen, acuerdo BM25/denso) en evaluación.</w:t>
+              <w:t>Por ahora solo se abstiene cuando no hay respaldo: si no se encuentran textos, si la respuesta del modelo no es válida o si, al quitar las citas que no se pueden comprobar, la respuesta queda vacía. Una regla que decida según la confianza en lo encontrado está en evaluación.</w:t>
             </w:r>
           </w:p>
         </w:tc>
@@ -1045,18 +1040,18 @@
       <w:pPr>
         <w:spacing w:before="140" w:after="40" w:line="240" w:lineRule="auto"/>
         <w:pBdr>
-          <w:bottom w:val="single" w:sz="6" w:space="1" w:color="1F3A5F"/>
+          <w:bottom w:val="single" w:sz="6" w:space="1" w:color="1E5B3A"/>
         </w:pBdr>
       </w:pPr>
       <w:r>
         <w:rPr>
-          <w:rFonts w:ascii="Calibri" w:hAnsi="Calibri" w:eastAsia="Calibri"/>
+          <w:rFonts w:ascii="Times New Roman" w:hAnsi="Times New Roman" w:eastAsia="Times New Roman"/>
           <w:b/>
           <w:i w:val="0"/>
-          <w:color w:val="1F3A5F"/>
+          <w:color w:val="1E5B3A"/>
           <w:sz w:val="22"/>
         </w:rPr>
-        <w:t>4. Riesgos identificados</w:t>
+        <w:t>4. Riesgos y limitaciones identificados</w:t>
       </w:r>
     </w:p>
     <w:p>
@@ -1065,21 +1060,21 @@
       </w:pPr>
       <w:r>
         <w:rPr>
-          <w:rFonts w:ascii="Calibri" w:hAnsi="Calibri" w:eastAsia="Calibri"/>
+          <w:rFonts w:ascii="Times New Roman" w:hAnsi="Times New Roman" w:eastAsia="Times New Roman"/>
           <w:b/>
           <w:i w:val="0"/>
           <w:sz w:val="20"/>
         </w:rPr>
-        <w:t xml:space="preserve">1. Tiempo de las 992 preguntas (≈6 h). </w:t>
+        <w:t xml:space="preserve">1. Tiempo para las 992 preguntas. </w:t>
       </w:r>
       <w:r>
         <w:rPr>
-          <w:rFonts w:ascii="Calibri" w:hAnsi="Calibri" w:eastAsia="Calibri"/>
+          <w:rFonts w:ascii="Times New Roman" w:hAnsi="Times New Roman" w:eastAsia="Times New Roman"/>
           <w:b w:val="0"/>
           <w:i w:val="0"/>
           <w:sz w:val="20"/>
         </w:rPr>
-        <w:t>11,8 s/pregunta con la GPU compartida con otros experimentos (4,3 s sin carga, e14); el objetivo es &lt;10 s y falta medirlo en máquina dedicada. Se congela una sola máquina y configuración para la corrida final y la verificación en vivo; un Mac M1 tarda ~145 s por pregunta.</w:t>
+        <w:t>Deben responderse en unas 6 horas. En la tarjeta gráfica RTX 4090 tardó 11,8 s por pregunta mientras se compartía con otras pruebas, y 4,3 s sin carga; el objetivo es menos de 10 s y falta medirlo en una máquina dedicada. Se fijará una sola máquina y una sola configuración para la corrida final y la verificación en vivo.</w:t>
       </w:r>
     </w:p>
     <w:p>
@@ -1088,21 +1083,21 @@
       </w:pPr>
       <w:r>
         <w:rPr>
-          <w:rFonts w:ascii="Calibri" w:hAnsi="Calibri" w:eastAsia="Calibri"/>
+          <w:rFonts w:ascii="Times New Roman" w:hAnsi="Times New Roman" w:eastAsia="Times New Roman"/>
           <w:b/>
           <w:i w:val="0"/>
           <w:sz w:val="20"/>
         </w:rPr>
-        <w:t xml:space="preserve">2. Recuperación a nivel de artículo, cerradas y dependencia del campo área. </w:t>
+        <w:t xml:space="preserve">2. Búsqueda del artículo exacto y preguntas cerradas. </w:t>
       </w:r>
       <w:r>
         <w:rPr>
-          <w:rFonts w:ascii="Calibri" w:hAnsi="Calibri" w:eastAsia="Calibri"/>
+          <w:rFonts w:ascii="Times New Roman" w:hAnsi="Times New Roman" w:eastAsia="Times New Roman"/>
           <w:b w:val="0"/>
           <w:i w:val="0"/>
           <w:sz w:val="20"/>
         </w:rPr>
-        <w:t>En muestra, art_hit@10 ≈ 0,4–0,6 y cerradas 0,733 frente a la referencia 0,905. La prioridad por área usa el campo «area» de la pregunta (presente en la muestra); si las 992 no lo traen, el puntaje será el de la recuperación sin ese refuerzo. Se prueban reranker y generation_k, un cambio por experimento.</w:t>
+        <w:t>En la muestra, el sistema acierta 11 de 15 de las preguntas cerradas, por debajo de la referencia (0,905), y no siempre encuentra el artículo preciso. La búsqueda da prioridad al área indicada en cada pregunta; si las 992 preguntas no la traen, el puntaje será algo menor. Se probarán mejoras de una en una.</w:t>
       </w:r>
     </w:p>
     <w:p>
@@ -1111,7 +1106,7 @@
       </w:pPr>
       <w:r>
         <w:rPr>
-          <w:rFonts w:ascii="Calibri" w:hAnsi="Calibri" w:eastAsia="Calibri"/>
+          <w:rFonts w:ascii="Times New Roman" w:hAnsi="Times New Roman" w:eastAsia="Times New Roman"/>
           <w:b/>
           <w:i w:val="0"/>
           <w:sz w:val="20"/>
@@ -1120,12 +1115,12 @@
       </w:r>
       <w:r>
         <w:rPr>
-          <w:rFonts w:ascii="Calibri" w:hAnsi="Calibri" w:eastAsia="Calibri"/>
+          <w:rFonts w:ascii="Times New Roman" w:hAnsi="Times New Roman" w:eastAsia="Times New Roman"/>
           <w:b w:val="0"/>
           <w:i w:val="0"/>
           <w:sz w:val="20"/>
         </w:rPr>
-        <w:t>7 respuestas incorrectas que valdrían 0,5 si se abstuviera; se evalúa una regla simple por formato, sin sobreajustar a 50 preguntas.</w:t>
+        <w:t>El sistema casi nunca se abstiene: 7 respuestas incorrectas habrían valido más de haberse abstenido. Se probará una regla sencilla, sin ajustarla en exceso a solo 50 preguntas.</w:t>
       </w:r>
     </w:p>
     <w:p>
@@ -1134,21 +1129,44 @@
       </w:pPr>
       <w:r>
         <w:rPr>
-          <w:rFonts w:ascii="Calibri" w:hAnsi="Calibri" w:eastAsia="Calibri"/>
+          <w:rFonts w:ascii="Times New Roman" w:hAnsi="Times New Roman" w:eastAsia="Times New Roman"/>
           <w:b/>
           <w:i w:val="0"/>
           <w:sz w:val="20"/>
         </w:rPr>
-        <w:t xml:space="preserve">4. Entrega del corpus y reproducibilidad. </w:t>
+        <w:t xml:space="preserve">4. Corpus desbalanceado. </w:t>
       </w:r>
       <w:r>
         <w:rPr>
-          <w:rFonts w:ascii="Calibri" w:hAnsi="Calibri" w:eastAsia="Calibri"/>
+          <w:rFonts w:ascii="Times New Roman" w:hAnsi="Times New Roman" w:eastAsia="Times New Roman"/>
           <w:b w:val="0"/>
           <w:i w:val="0"/>
           <w:sz w:val="20"/>
         </w:rPr>
-        <w:t>Falta el empaquetado, el enlace público verificado en ventana privada y la prueba en contenedor limpio (reproducir.py); la interfaz sigue pendiente.</w:t>
+        <w:t>La mayoría de los documentos son sentencias de la Corte Constitucional, y el derecho de los mercados tiene pocos. Esto puede restar cobertura en las áreas menos representadas; además, las áreas asignadas a 30 documentos adicionales aún no están confirmadas.</w:t>
+      </w:r>
+    </w:p>
+    <w:p>
+      <w:pPr>
+        <w:spacing w:before="0" w:after="20" w:line="240" w:lineRule="auto"/>
+      </w:pPr>
+      <w:r>
+        <w:rPr>
+          <w:rFonts w:ascii="Times New Roman" w:hAnsi="Times New Roman" w:eastAsia="Times New Roman"/>
+          <w:b/>
+          <w:i w:val="0"/>
+          <w:sz w:val="20"/>
+        </w:rPr>
+        <w:t xml:space="preserve">5. Entrega final. </w:t>
+      </w:r>
+      <w:r>
+        <w:rPr>
+          <w:rFonts w:ascii="Times New Roman" w:hAnsi="Times New Roman" w:eastAsia="Times New Roman"/>
+          <w:b w:val="0"/>
+          <w:i w:val="0"/>
+          <w:sz w:val="20"/>
+        </w:rPr>
+        <w:t>Faltan empaquetar el corpus, comprobar que el enlace público abre sin sesión iniciada, probar la reproducción desde cero y construir la interfaz.</w:t>
       </w:r>
     </w:p>
     <w:sectPr>
@@ -1525,7 +1543,7 @@
     <w:qFormat/>
     <w:rsid w:val="00FC693F"/>
     <w:rPr>
-      <w:rFonts w:ascii="Calibri" w:hAnsi="Calibri"/>
+      <w:rFonts w:ascii="Times New Roman" w:hAnsi="Times New Roman"/>
       <w:sz w:val="20"/>
     </w:rPr>
   </w:style>

</xml_diff>

<commit_message>
Reporte del viernes: sin corrida en el encabezado, linea de evaluate.py y mas interlineado
- Se quita Corrida/commit del encabezado
- Se repone el comando de evaluate.py sobre la primera tabla
- Interlineado 1,05 y margenes verticales de 1,1 cm; sigue en una pagina

Co-Authored-By: Claude Sonnet 5.5 <noreply@anthropic.com>
Claude-Session: https://claude.ai/code/session_01REsYNXurAR9RNVP1dufnHg
</commit_message>
<xml_diff>
--- a/entregas/viernes/REPORTE_AVANCE.docx
+++ b/entregas/viernes/REPORTE_AVANCE.docx
@@ -4,7 +4,7 @@
   <w:body>
     <w:p>
       <w:pPr>
-        <w:spacing w:before="0" w:after="40" w:line="240" w:lineRule="auto"/>
+        <w:spacing w:before="0" w:after="40" w:line="252" w:lineRule="auto"/>
       </w:pPr>
       <w:r>
         <w:rPr>
@@ -19,7 +19,7 @@
     </w:p>
     <w:p>
       <w:pPr>
-        <w:spacing w:before="0" w:after="0" w:line="240" w:lineRule="auto"/>
+        <w:spacing w:before="0" w:after="0" w:line="252" w:lineRule="auto"/>
       </w:pPr>
       <w:r>
         <w:rPr>
@@ -60,14 +60,14 @@
     </w:p>
     <w:p>
       <w:pPr>
-        <w:spacing w:before="0" w:after="0" w:line="240" w:lineRule="auto"/>
+        <w:spacing w:before="0" w:after="0" w:line="252" w:lineRule="auto"/>
       </w:pPr>
       <w:r>
         <w:rPr>
           <w:rFonts w:ascii="Times New Roman" w:hAnsi="Times New Roman" w:eastAsia="Times New Roman"/>
           <w:b/>
           <w:i w:val="0"/>
-          <w:sz w:val="18"/>
+          <w:sz w:val="20"/>
         </w:rPr>
         <w:t xml:space="preserve">Fecha de la medición: </w:t>
       </w:r>
@@ -76,23 +76,14 @@
           <w:rFonts w:ascii="Times New Roman" w:hAnsi="Times New Roman" w:eastAsia="Times New Roman"/>
           <w:b w:val="0"/>
           <w:i w:val="0"/>
-          <w:sz w:val="18"/>
+          <w:sz w:val="20"/>
         </w:rPr>
         <w:t>2026-10-02</w:t>
-      </w:r>
-      <w:r>
-        <w:rPr>
-          <w:rFonts w:ascii="Times New Roman" w:hAnsi="Times New Roman" w:eastAsia="Times New Roman"/>
-          <w:b w:val="0"/>
-          <w:i w:val="0"/>
-          <w:sz w:val="18"/>
-        </w:rPr>
-        <w:t xml:space="preserve">    Corrida: e16_area200 (commit 26932e7)</w:t>
       </w:r>
     </w:p>
     <w:p>
       <w:pPr>
-        <w:spacing w:before="140" w:after="40" w:line="240" w:lineRule="auto"/>
+        <w:spacing w:before="140" w:after="40" w:line="252" w:lineRule="auto"/>
         <w:pBdr>
           <w:bottom w:val="single" w:sz="6" w:space="1" w:color="1E5B3A"/>
         </w:pBdr>
@@ -106,6 +97,20 @@
           <w:sz w:val="22"/>
         </w:rPr>
         <w:t>1. Puntaje sobre las preguntas de muestra</w:t>
+      </w:r>
+    </w:p>
+    <w:p>
+      <w:pPr>
+        <w:spacing w:before="0" w:after="40" w:line="252" w:lineRule="auto"/>
+      </w:pPr>
+      <w:r>
+        <w:rPr>
+          <w:rFonts w:ascii="Times New Roman" w:hAnsi="Times New Roman" w:eastAsia="Times New Roman"/>
+          <w:b w:val="0"/>
+          <w:i/>
+          <w:sz w:val="17"/>
+        </w:rPr>
+        <w:t>Resultado de python scripts/evaluate.py --submission &lt;archivo&gt; --split sample.</w:t>
       </w:r>
     </w:p>
     <w:tbl>
@@ -133,7 +138,7 @@
           </w:tcPr>
           <w:p>
             <w:pPr>
-              <w:spacing w:before="20" w:after="20" w:line="240" w:lineRule="auto"/>
+              <w:spacing w:before="20" w:after="20" w:line="252" w:lineRule="auto"/>
             </w:pPr>
             <w:r>
               <w:rPr>
@@ -154,7 +159,7 @@
           </w:tcPr>
           <w:p>
             <w:pPr>
-              <w:spacing w:before="20" w:after="20" w:line="240" w:lineRule="auto"/>
+              <w:spacing w:before="20" w:after="20" w:line="252" w:lineRule="auto"/>
               <w:jc w:val="right"/>
             </w:pPr>
             <w:r>
@@ -176,7 +181,7 @@
           </w:tcPr>
           <w:p>
             <w:pPr>
-              <w:spacing w:before="20" w:after="20" w:line="240" w:lineRule="auto"/>
+              <w:spacing w:before="20" w:after="20" w:line="252" w:lineRule="auto"/>
               <w:jc w:val="right"/>
             </w:pPr>
             <w:r>
@@ -199,7 +204,7 @@
           </w:tcPr>
           <w:p>
             <w:pPr>
-              <w:spacing w:before="20" w:after="20" w:line="240" w:lineRule="auto"/>
+              <w:spacing w:before="20" w:after="20" w:line="252" w:lineRule="auto"/>
             </w:pPr>
             <w:r>
               <w:rPr>
@@ -218,7 +223,7 @@
           </w:tcPr>
           <w:p>
             <w:pPr>
-              <w:spacing w:before="20" w:after="20" w:line="240" w:lineRule="auto"/>
+              <w:spacing w:before="20" w:after="20" w:line="252" w:lineRule="auto"/>
               <w:jc w:val="right"/>
             </w:pPr>
             <w:r>
@@ -238,7 +243,7 @@
           </w:tcPr>
           <w:p>
             <w:pPr>
-              <w:spacing w:before="20" w:after="20" w:line="240" w:lineRule="auto"/>
+              <w:spacing w:before="20" w:after="20" w:line="252" w:lineRule="auto"/>
               <w:jc w:val="right"/>
             </w:pPr>
             <w:r>
@@ -260,7 +265,7 @@
           </w:tcPr>
           <w:p>
             <w:pPr>
-              <w:spacing w:before="20" w:after="20" w:line="240" w:lineRule="auto"/>
+              <w:spacing w:before="20" w:after="20" w:line="252" w:lineRule="auto"/>
             </w:pPr>
             <w:r>
               <w:rPr>
@@ -279,7 +284,7 @@
           </w:tcPr>
           <w:p>
             <w:pPr>
-              <w:spacing w:before="20" w:after="20" w:line="240" w:lineRule="auto"/>
+              <w:spacing w:before="20" w:after="20" w:line="252" w:lineRule="auto"/>
               <w:jc w:val="right"/>
             </w:pPr>
             <w:r>
@@ -299,7 +304,7 @@
           </w:tcPr>
           <w:p>
             <w:pPr>
-              <w:spacing w:before="20" w:after="20" w:line="240" w:lineRule="auto"/>
+              <w:spacing w:before="20" w:after="20" w:line="252" w:lineRule="auto"/>
               <w:jc w:val="right"/>
             </w:pPr>
             <w:r>
@@ -321,7 +326,7 @@
           </w:tcPr>
           <w:p>
             <w:pPr>
-              <w:spacing w:before="20" w:after="20" w:line="240" w:lineRule="auto"/>
+              <w:spacing w:before="20" w:after="20" w:line="252" w:lineRule="auto"/>
             </w:pPr>
             <w:r>
               <w:rPr>
@@ -340,7 +345,7 @@
           </w:tcPr>
           <w:p>
             <w:pPr>
-              <w:spacing w:before="20" w:after="20" w:line="240" w:lineRule="auto"/>
+              <w:spacing w:before="20" w:after="20" w:line="252" w:lineRule="auto"/>
               <w:jc w:val="right"/>
             </w:pPr>
             <w:r>
@@ -360,7 +365,7 @@
           </w:tcPr>
           <w:p>
             <w:pPr>
-              <w:spacing w:before="20" w:after="20" w:line="240" w:lineRule="auto"/>
+              <w:spacing w:before="20" w:after="20" w:line="252" w:lineRule="auto"/>
               <w:jc w:val="right"/>
             </w:pPr>
             <w:r>
@@ -383,7 +388,7 @@
           </w:tcPr>
           <w:p>
             <w:pPr>
-              <w:spacing w:before="20" w:after="20" w:line="240" w:lineRule="auto"/>
+              <w:spacing w:before="20" w:after="20" w:line="252" w:lineRule="auto"/>
             </w:pPr>
             <w:r>
               <w:rPr>
@@ -403,7 +408,7 @@
           </w:tcPr>
           <w:p>
             <w:pPr>
-              <w:spacing w:before="20" w:after="20" w:line="240" w:lineRule="auto"/>
+              <w:spacing w:before="20" w:after="20" w:line="252" w:lineRule="auto"/>
               <w:jc w:val="right"/>
             </w:pPr>
             <w:r>
@@ -424,7 +429,7 @@
           </w:tcPr>
           <w:p>
             <w:pPr>
-              <w:spacing w:before="20" w:after="20" w:line="240" w:lineRule="auto"/>
+              <w:spacing w:before="20" w:after="20" w:line="252" w:lineRule="auto"/>
               <w:jc w:val="right"/>
             </w:pPr>
             <w:r>
@@ -442,7 +447,7 @@
     </w:tbl>
     <w:p>
       <w:pPr>
-        <w:spacing w:before="60" w:after="0" w:line="240" w:lineRule="auto"/>
+        <w:spacing w:before="60" w:after="0" w:line="252" w:lineRule="auto"/>
       </w:pPr>
       <w:r>
         <w:rPr>
@@ -474,7 +479,7 @@
     </w:p>
     <w:p>
       <w:pPr>
-        <w:spacing w:before="140" w:after="40" w:line="240" w:lineRule="auto"/>
+        <w:spacing w:before="140" w:after="40" w:line="252" w:lineRule="auto"/>
         <w:pBdr>
           <w:bottom w:val="single" w:sz="6" w:space="1" w:color="1E5B3A"/>
         </w:pBdr>
@@ -514,7 +519,7 @@
           </w:tcPr>
           <w:p>
             <w:pPr>
-              <w:spacing w:before="20" w:after="20" w:line="240" w:lineRule="auto"/>
+              <w:spacing w:before="20" w:after="20" w:line="252" w:lineRule="auto"/>
             </w:pPr>
             <w:r>
               <w:rPr>
@@ -535,7 +540,7 @@
           </w:tcPr>
           <w:p>
             <w:pPr>
-              <w:spacing w:before="20" w:after="20" w:line="240" w:lineRule="auto"/>
+              <w:spacing w:before="20" w:after="20" w:line="252" w:lineRule="auto"/>
             </w:pPr>
             <w:r>
               <w:rPr>
@@ -557,7 +562,7 @@
           </w:tcPr>
           <w:p>
             <w:pPr>
-              <w:spacing w:before="20" w:after="20" w:line="240" w:lineRule="auto"/>
+              <w:spacing w:before="20" w:after="20" w:line="252" w:lineRule="auto"/>
             </w:pPr>
             <w:r>
               <w:rPr>
@@ -576,7 +581,7 @@
           </w:tcPr>
           <w:p>
             <w:pPr>
-              <w:spacing w:before="20" w:after="20" w:line="240" w:lineRule="auto"/>
+              <w:spacing w:before="20" w:after="20" w:line="252" w:lineRule="auto"/>
             </w:pPr>
             <w:r>
               <w:rPr>
@@ -597,7 +602,7 @@
           </w:tcPr>
           <w:p>
             <w:pPr>
-              <w:spacing w:before="20" w:after="20" w:line="240" w:lineRule="auto"/>
+              <w:spacing w:before="20" w:after="20" w:line="252" w:lineRule="auto"/>
             </w:pPr>
             <w:r>
               <w:rPr>
@@ -616,7 +621,7 @@
           </w:tcPr>
           <w:p>
             <w:pPr>
-              <w:spacing w:before="20" w:after="20" w:line="240" w:lineRule="auto"/>
+              <w:spacing w:before="20" w:after="20" w:line="252" w:lineRule="auto"/>
             </w:pPr>
             <w:r>
               <w:rPr>
@@ -637,7 +642,7 @@
           </w:tcPr>
           <w:p>
             <w:pPr>
-              <w:spacing w:before="20" w:after="20" w:line="240" w:lineRule="auto"/>
+              <w:spacing w:before="20" w:after="20" w:line="252" w:lineRule="auto"/>
             </w:pPr>
             <w:r>
               <w:rPr>
@@ -656,7 +661,7 @@
           </w:tcPr>
           <w:p>
             <w:pPr>
-              <w:spacing w:before="20" w:after="20" w:line="240" w:lineRule="auto"/>
+              <w:spacing w:before="20" w:after="20" w:line="252" w:lineRule="auto"/>
             </w:pPr>
             <w:r>
               <w:rPr>
@@ -677,7 +682,7 @@
           </w:tcPr>
           <w:p>
             <w:pPr>
-              <w:spacing w:before="20" w:after="20" w:line="240" w:lineRule="auto"/>
+              <w:spacing w:before="20" w:after="20" w:line="252" w:lineRule="auto"/>
             </w:pPr>
             <w:r>
               <w:rPr>
@@ -696,7 +701,7 @@
           </w:tcPr>
           <w:p>
             <w:pPr>
-              <w:spacing w:before="20" w:after="20" w:line="240" w:lineRule="auto"/>
+              <w:spacing w:before="20" w:after="20" w:line="252" w:lineRule="auto"/>
             </w:pPr>
             <w:r>
               <w:rPr>
@@ -713,7 +718,7 @@
     </w:tbl>
     <w:p>
       <w:pPr>
-        <w:spacing w:before="60" w:after="0" w:line="240" w:lineRule="auto"/>
+        <w:spacing w:before="60" w:after="0" w:line="252" w:lineRule="auto"/>
       </w:pPr>
       <w:r>
         <w:rPr>
@@ -736,7 +741,7 @@
     </w:p>
     <w:p>
       <w:pPr>
-        <w:spacing w:before="0" w:after="0" w:line="240" w:lineRule="auto"/>
+        <w:spacing w:before="0" w:after="0" w:line="252" w:lineRule="auto"/>
       </w:pPr>
       <w:r>
         <w:rPr>
@@ -759,7 +764,7 @@
     </w:p>
     <w:p>
       <w:pPr>
-        <w:spacing w:before="140" w:after="40" w:line="240" w:lineRule="auto"/>
+        <w:spacing w:before="140" w:after="40" w:line="252" w:lineRule="auto"/>
         <w:pBdr>
           <w:bottom w:val="single" w:sz="6" w:space="1" w:color="1E5B3A"/>
         </w:pBdr>
@@ -799,7 +804,7 @@
           </w:tcPr>
           <w:p>
             <w:pPr>
-              <w:spacing w:before="20" w:after="20" w:line="240" w:lineRule="auto"/>
+              <w:spacing w:before="20" w:after="20" w:line="252" w:lineRule="auto"/>
             </w:pPr>
             <w:r>
               <w:rPr>
@@ -820,7 +825,7 @@
           </w:tcPr>
           <w:p>
             <w:pPr>
-              <w:spacing w:before="20" w:after="20" w:line="240" w:lineRule="auto"/>
+              <w:spacing w:before="20" w:after="20" w:line="252" w:lineRule="auto"/>
             </w:pPr>
             <w:r>
               <w:rPr>
@@ -842,7 +847,7 @@
           </w:tcPr>
           <w:p>
             <w:pPr>
-              <w:spacing w:before="20" w:after="20" w:line="240" w:lineRule="auto"/>
+              <w:spacing w:before="20" w:after="20" w:line="252" w:lineRule="auto"/>
             </w:pPr>
             <w:r>
               <w:rPr>
@@ -861,7 +866,7 @@
           </w:tcPr>
           <w:p>
             <w:pPr>
-              <w:spacing w:before="20" w:after="20" w:line="240" w:lineRule="auto"/>
+              <w:spacing w:before="20" w:after="20" w:line="252" w:lineRule="auto"/>
             </w:pPr>
             <w:r>
               <w:rPr>
@@ -882,7 +887,7 @@
           </w:tcPr>
           <w:p>
             <w:pPr>
-              <w:spacing w:before="20" w:after="20" w:line="240" w:lineRule="auto"/>
+              <w:spacing w:before="20" w:after="20" w:line="252" w:lineRule="auto"/>
             </w:pPr>
             <w:r>
               <w:rPr>
@@ -901,7 +906,7 @@
           </w:tcPr>
           <w:p>
             <w:pPr>
-              <w:spacing w:before="20" w:after="20" w:line="240" w:lineRule="auto"/>
+              <w:spacing w:before="20" w:after="20" w:line="252" w:lineRule="auto"/>
             </w:pPr>
             <w:r>
               <w:rPr>
@@ -922,7 +927,7 @@
           </w:tcPr>
           <w:p>
             <w:pPr>
-              <w:spacing w:before="20" w:after="20" w:line="240" w:lineRule="auto"/>
+              <w:spacing w:before="20" w:after="20" w:line="252" w:lineRule="auto"/>
             </w:pPr>
             <w:r>
               <w:rPr>
@@ -941,7 +946,7 @@
           </w:tcPr>
           <w:p>
             <w:pPr>
-              <w:spacing w:before="20" w:after="20" w:line="240" w:lineRule="auto"/>
+              <w:spacing w:before="20" w:after="20" w:line="252" w:lineRule="auto"/>
             </w:pPr>
             <w:r>
               <w:rPr>
@@ -962,7 +967,7 @@
           </w:tcPr>
           <w:p>
             <w:pPr>
-              <w:spacing w:before="20" w:after="20" w:line="240" w:lineRule="auto"/>
+              <w:spacing w:before="20" w:after="20" w:line="252" w:lineRule="auto"/>
             </w:pPr>
             <w:r>
               <w:rPr>
@@ -981,7 +986,7 @@
           </w:tcPr>
           <w:p>
             <w:pPr>
-              <w:spacing w:before="20" w:after="20" w:line="240" w:lineRule="auto"/>
+              <w:spacing w:before="20" w:after="20" w:line="252" w:lineRule="auto"/>
             </w:pPr>
             <w:r>
               <w:rPr>
@@ -1002,7 +1007,7 @@
           </w:tcPr>
           <w:p>
             <w:pPr>
-              <w:spacing w:before="20" w:after="20" w:line="240" w:lineRule="auto"/>
+              <w:spacing w:before="20" w:after="20" w:line="252" w:lineRule="auto"/>
             </w:pPr>
             <w:r>
               <w:rPr>
@@ -1021,7 +1026,7 @@
           </w:tcPr>
           <w:p>
             <w:pPr>
-              <w:spacing w:before="20" w:after="20" w:line="240" w:lineRule="auto"/>
+              <w:spacing w:before="20" w:after="20" w:line="252" w:lineRule="auto"/>
             </w:pPr>
             <w:r>
               <w:rPr>
@@ -1038,7 +1043,7 @@
     </w:tbl>
     <w:p>
       <w:pPr>
-        <w:spacing w:before="140" w:after="40" w:line="240" w:lineRule="auto"/>
+        <w:spacing w:before="140" w:after="40" w:line="252" w:lineRule="auto"/>
         <w:pBdr>
           <w:bottom w:val="single" w:sz="6" w:space="1" w:color="1E5B3A"/>
         </w:pBdr>
@@ -1056,7 +1061,7 @@
     </w:p>
     <w:p>
       <w:pPr>
-        <w:spacing w:before="0" w:after="20" w:line="240" w:lineRule="auto"/>
+        <w:spacing w:before="0" w:after="20" w:line="252" w:lineRule="auto"/>
       </w:pPr>
       <w:r>
         <w:rPr>
@@ -1079,7 +1084,7 @@
     </w:p>
     <w:p>
       <w:pPr>
-        <w:spacing w:before="0" w:after="20" w:line="240" w:lineRule="auto"/>
+        <w:spacing w:before="0" w:after="20" w:line="252" w:lineRule="auto"/>
       </w:pPr>
       <w:r>
         <w:rPr>
@@ -1102,7 +1107,7 @@
     </w:p>
     <w:p>
       <w:pPr>
-        <w:spacing w:before="0" w:after="20" w:line="240" w:lineRule="auto"/>
+        <w:spacing w:before="0" w:after="20" w:line="252" w:lineRule="auto"/>
       </w:pPr>
       <w:r>
         <w:rPr>
@@ -1125,7 +1130,7 @@
     </w:p>
     <w:p>
       <w:pPr>
-        <w:spacing w:before="0" w:after="20" w:line="240" w:lineRule="auto"/>
+        <w:spacing w:before="0" w:after="20" w:line="252" w:lineRule="auto"/>
       </w:pPr>
       <w:r>
         <w:rPr>
@@ -1148,7 +1153,7 @@
     </w:p>
     <w:p>
       <w:pPr>
-        <w:spacing w:before="0" w:after="20" w:line="240" w:lineRule="auto"/>
+        <w:spacing w:before="0" w:after="20" w:line="252" w:lineRule="auto"/>
       </w:pPr>
       <w:r>
         <w:rPr>
@@ -1171,7 +1176,7 @@
     </w:p>
     <w:sectPr>
       <w:pgSz w:w="11906" w:h="16838"/>
-      <w:pgMar w:top="794" w:right="964" w:bottom="794" w:left="964" w:header="720" w:footer="720" w:gutter="0"/>
+      <w:pgMar w:top="624" w:right="964" w:bottom="624" w:left="964" w:header="720" w:footer="720" w:gutter="0"/>
       <w:cols w:space="720"/>
       <w:docGrid w:linePitch="360"/>
     </w:sectPr>

</xml_diff>

<commit_message>
Avance del viernes: corrida e20 sobre corpus v4, reporte y congelado
- e20_avance_v4: sample_50 completo con el corpus v4 (1186 documentos) y la configuracion por defecto;
  40,59/50 sin RAGAS (cerradas 14,67, citacion 17,55, abstencion 8,37), 4,2 s/pregunta en la RTX 4090
- Identica pregunta por pregunta a e19_corpus_v4_t (comparar_entregas: 0 diferencias)
- REPORTE_AVANCE.docx/pdf regenerados con build_reporte.py sobre e20; limitaciones de corpus y entrega
  actualizadas al v4 y al congelado
- respuestas_sample.jsonl: la entrega que se envia (copia de evaluation/generacion/e20_avance_v4/entrega.jsonl)
- CONGELADO.md: hashes de corpus, indice, snapshot, GGUF y build de llama.cpp, y como reproducir desde el tag
- package_corpus.py --sin-licencia para snapshots internos (no publicables)

Co-Authored-By: Claude Opus 5.5 <noreply@anthropic.com>
Claude-Session: https://claude.ai/code/session_01Wnmn1xn5pTamPKfQTFV2EL
</commit_message>
<xml_diff>
--- a/entregas/viernes/REPORTE_AVANCE.docx
+++ b/entregas/viernes/REPORTE_AVANCE.docx
@@ -110,7 +110,7 @@
           <w:i/>
           <w:sz w:val="17"/>
         </w:rPr>
-        <w:t>Resultado de python scripts/evaluate.py --submission salidas/sample_e16_area200.jsonl --split sample.</w:t>
+        <w:t>Resultado de python scripts/evaluate.py --submission salidas/sample_e20_avance_v4.jsonl --split sample.</w:t>
       </w:r>
     </w:p>
     <w:tbl>
@@ -465,7 +465,7 @@
           <w:i w:val="0"/>
           <w:sz w:val="20"/>
         </w:rPr>
-        <w:t xml:space="preserve">Preguntas cerradas: 11 de 15 correctas (la referencia es 0,905). Citación: ninguna de las 176 citas emitidas carece de respaldo en los textos recuperados. </w:t>
+        <w:t xml:space="preserve">Preguntas cerradas: 11 de 15 correctas (la referencia es 0,905). Citación: ninguna de las 178 citas emitidas carece de respaldo en los textos recuperados. </w:t>
       </w:r>
       <w:r>
         <w:rPr>
@@ -590,7 +590,7 @@
                 <w:i w:val="0"/>
                 <w:sz w:val="19"/>
               </w:rPr>
-              <w:t>588</w:t>
+              <w:t>1.186</w:t>
             </w:r>
           </w:p>
         </w:tc>
@@ -630,7 +630,7 @@
                 <w:i w:val="0"/>
                 <w:sz w:val="19"/>
               </w:rPr>
-              <w:t>113.519</w:t>
+              <w:t>173.393</w:t>
             </w:r>
           </w:p>
         </w:tc>
@@ -736,7 +736,7 @@
           <w:i w:val="0"/>
           <w:sz w:val="20"/>
         </w:rPr>
-        <w:t>Relatoría de la Corte Constitucional (377); normogramas (CRA, Colpensiones, DIAN; compilación Avance Jurídico) (83); Secretaría del Senado (67); Gestor Normativo de Función Pública (30); Relatoría de la Corte Suprema de Justicia (18); otras (Régimen Legal de Bogotá, ICBF, RedJurista) (8); normograma de la DIAN (3); Comunidad Andina (2).</w:t>
+        <w:t>Relatoría de la Corte Constitucional (938); normogramas (CRA, Colpensiones, DIAN; compilación Avance Jurídico) (112); Secretaría del Senado (72); Gestor Normativo de Función Pública (30); Relatoría de la Corte Suprema de Justicia (18); otras (Régimen Legal de Bogotá, ICBF, RedJurista) (8); Comunidad Andina (5); normograma de la DIAN (3).</w:t>
       </w:r>
     </w:p>
     <w:p>
@@ -759,7 +759,7 @@
           <w:i w:val="0"/>
           <w:sz w:val="20"/>
         </w:rPr>
-        <w:t>(un documento puede pertenecer a varias): constitucional 340, laboral 56, de familia 49, penal 45, administrativo 40, comercial y sociedades 36, civil 35, tributario 31, procesal 28, mercados 25.</w:t>
+        <w:t>(un documento puede pertenecer a varias): constitucional 901, laboral 62, de familia 54, administrativo 52, penal 51, civil 45, tributario 41, mercados 39, procesal 38, comercial y sociedades 36.</w:t>
       </w:r>
     </w:p>
     <w:p>
@@ -1079,7 +1079,7 @@
           <w:i w:val="0"/>
           <w:sz w:val="20"/>
         </w:rPr>
-        <w:t>Deben responderse en unas 6 horas. En la tarjeta gráfica RTX 4090 tardó 11,8 s por pregunta mientras se compartía con otras pruebas, y 4,3 s sin carga; el objetivo es menos de 10 s y falta medirlo en una máquina dedicada. Se fijará una sola máquina y una sola configuración para la corrida final y la verificación en vivo.</w:t>
+        <w:t>Deben responderse en unas 6 horas. En la tarjeta gráfica RTX 4090 tarda 4,2 s por pregunta, dentro del objetivo (menos de 10 s). Se fijará una sola máquina y una sola configuración para la corrida final y la verificación en vivo.</w:t>
       </w:r>
     </w:p>
     <w:p>
@@ -1148,7 +1148,7 @@
           <w:i w:val="0"/>
           <w:sz w:val="20"/>
         </w:rPr>
-        <w:t>La mayoría de los documentos son sentencias de la Corte Constitucional, y el derecho de los mercados tiene pocos. Esto puede restar cobertura en las áreas menos representadas; además, las áreas asignadas a 30 documentos adicionales aún no están confirmadas.</w:t>
+        <w:t>La mayoría de los documentos son sentencias de la Corte Constitucional; casi todas se usan solo cuando la pregunta las nombra, para que no desplacen a las normas. Comercial, procesal y mercados siguen siendo las áreas con menos documentos, y las áreas asignadas a los documentos añadidos aún deben confirmarse.</w:t>
       </w:r>
     </w:p>
     <w:p>
@@ -1171,7 +1171,7 @@
           <w:i w:val="0"/>
           <w:sz w:val="20"/>
         </w:rPr>
-        <w:t>Faltan empaquetar el corpus, comprobar que el enlace público abre sin sesión iniciada, probar la reproducción desde cero y construir la interfaz.</w:t>
+        <w:t>El código, los textos y el índice de esta medición quedaron congelados para reproducir estas respuestas. Falta publicar el corpus con un enlace que abra sin sesión iniciada y construir la interfaz.</w:t>
       </w:r>
     </w:p>
     <w:sectPr>

</xml_diff>

<commit_message>
Reporte del viernes con juez RAGAS sobre e20 (53,17/80)
- evaluate.py --ragas sobre la misma entrega de e20_avance_v4: texto libre 12,58/30 (correctness 0,4195),
  total automatico 53,17/80; el juez no dio veredicto en 4 de 35 (cuentan como cero; 0,474 en las juzgadas)
- build_reporte.py: con RAGAS, fila del juez en la tabla y total sobre 80; la observacion aclara los items sin
  veredicto y el total sin juez (40,59/50); textos de limitaciones y margenes recortados para seguir en 1 pagina
- CONGELADO.md: puntaje con juez; el tag avance-viernes no se mueve (las respuestas no cambiaron)

Co-Authored-By: Claude Opus 5.5 <noreply@anthropic.com>
Claude-Session: https://claude.ai/code/session_01Wnmn1xn5pTamPKfQTFV2EL
</commit_message>
<xml_diff>
--- a/entregas/viernes/REPORTE_AVANCE.docx
+++ b/entregas/viernes/REPORTE_AVANCE.docx
@@ -110,7 +110,7 @@
           <w:i/>
           <w:sz w:val="17"/>
         </w:rPr>
-        <w:t>Resultado de python scripts/evaluate.py --submission salidas/sample_e20_avance_v4.jsonl --split sample.</w:t>
+        <w:t>Resultado de python scripts/evaluate.py --submission salidas/sample_e20_avance_v4.jsonl --split sample --ragas.</w:t>
       </w:r>
     </w:p>
     <w:tbl>
@@ -274,6 +274,67 @@
                 <w:i w:val="0"/>
                 <w:sz w:val="19"/>
               </w:rPr>
+              <w:t>Corrección de texto libre (juez RAGAS)</w:t>
+            </w:r>
+          </w:p>
+        </w:tc>
+        <w:tc>
+          <w:tcPr>
+            <w:tcW w:type="dxa" w:w="2551"/>
+          </w:tcPr>
+          <w:p>
+            <w:pPr>
+              <w:spacing w:before="20" w:after="20" w:line="252" w:lineRule="auto"/>
+              <w:jc w:val="right"/>
+            </w:pPr>
+            <w:r>
+              <w:rPr>
+                <w:rFonts w:ascii="Times New Roman" w:hAnsi="Times New Roman" w:eastAsia="Times New Roman"/>
+                <w:b w:val="0"/>
+                <w:i w:val="0"/>
+                <w:sz w:val="19"/>
+              </w:rPr>
+              <w:t>12,58</w:t>
+            </w:r>
+          </w:p>
+        </w:tc>
+        <w:tc>
+          <w:tcPr>
+            <w:tcW w:type="dxa" w:w="2551"/>
+          </w:tcPr>
+          <w:p>
+            <w:pPr>
+              <w:spacing w:before="20" w:after="20" w:line="252" w:lineRule="auto"/>
+              <w:jc w:val="right"/>
+            </w:pPr>
+            <w:r>
+              <w:rPr>
+                <w:rFonts w:ascii="Times New Roman" w:hAnsi="Times New Roman" w:eastAsia="Times New Roman"/>
+                <w:b w:val="0"/>
+                <w:i w:val="0"/>
+                <w:sz w:val="19"/>
+              </w:rPr>
+              <w:t>30</w:t>
+            </w:r>
+          </w:p>
+        </w:tc>
+      </w:tr>
+      <w:tr>
+        <w:tc>
+          <w:tcPr>
+            <w:tcW w:type="dxa" w:w="4535"/>
+          </w:tcPr>
+          <w:p>
+            <w:pPr>
+              <w:spacing w:before="20" w:after="20" w:line="252" w:lineRule="auto"/>
+            </w:pPr>
+            <w:r>
+              <w:rPr>
+                <w:rFonts w:ascii="Times New Roman" w:hAnsi="Times New Roman" w:eastAsia="Times New Roman"/>
+                <w:b w:val="0"/>
+                <w:i w:val="0"/>
+                <w:sz w:val="19"/>
+              </w:rPr>
               <w:t>Calidad de citación</w:t>
             </w:r>
           </w:p>
@@ -397,7 +458,7 @@
                 <w:i w:val="0"/>
                 <w:sz w:val="19"/>
               </w:rPr>
-              <w:t>Total automático sin RAGAS</w:t>
+              <w:t>Total automático</w:t>
             </w:r>
           </w:p>
         </w:tc>
@@ -418,7 +479,7 @@
                 <w:i w:val="0"/>
                 <w:sz w:val="19"/>
               </w:rPr>
-              <w:t>40,59</w:t>
+              <w:t>53,17</w:t>
             </w:r>
           </w:p>
         </w:tc>
@@ -439,7 +500,7 @@
                 <w:i w:val="0"/>
                 <w:sz w:val="19"/>
               </w:rPr>
-              <w:t>50</w:t>
+              <w:t>80</w:t>
             </w:r>
           </w:p>
         </w:tc>
@@ -475,6 +536,15 @@
           <w:sz w:val="20"/>
         </w:rPr>
         <w:t>Abstención: 0 abstenciones; 36 de 43 preguntas respondidas bien.</w:t>
+      </w:r>
+      <w:r>
+        <w:rPr>
+          <w:rFonts w:ascii="Times New Roman" w:hAnsi="Times New Roman" w:eastAsia="Times New Roman"/>
+          <w:b w:val="0"/>
+          <w:i w:val="0"/>
+          <w:sz w:val="20"/>
+        </w:rPr>
+        <w:t xml:space="preserve"> Texto libre: corrección 0,419 (referencia 0,451); 4 de 35 respuestas quedaron sin veredicto del juez y cuentan como cero (0,474 en las 31 juzgadas). Sin el juez: 40,59 de 50.</w:t>
       </w:r>
     </w:p>
     <w:p>
@@ -1079,7 +1149,7 @@
           <w:i w:val="0"/>
           <w:sz w:val="20"/>
         </w:rPr>
-        <w:t>Deben responderse en unas 6 horas. En la tarjeta gráfica RTX 4090 tarda 4,2 s por pregunta, dentro del objetivo (menos de 10 s). Se fijará una sola máquina y una sola configuración para la corrida final y la verificación en vivo.</w:t>
+        <w:t>Deben responderse en unas 6 horas. En la RTX 4090 tarda 4,2 s por pregunta, dentro del objetivo (menos de 10 s). La corrida final y la verificación en vivo usarán una sola máquina y configuración.</w:t>
       </w:r>
     </w:p>
     <w:p>
@@ -1148,7 +1218,7 @@
           <w:i w:val="0"/>
           <w:sz w:val="20"/>
         </w:rPr>
-        <w:t>La mayoría de los documentos son sentencias de la Corte Constitucional; casi todas se usan solo cuando la pregunta las nombra, para que no desplacen a las normas. Comercial, procesal y mercados siguen siendo las áreas con menos documentos, y las áreas asignadas a los documentos añadidos aún deben confirmarse.</w:t>
+        <w:t>La mayoría de los documentos son sentencias de la Corte Constitucional, casi todas usadas solo si la pregunta las nombra. Comercial, procesal y mercados tienen menos documentos; faltan confirmar áreas.</w:t>
       </w:r>
     </w:p>
     <w:p>
@@ -1171,12 +1241,12 @@
           <w:i w:val="0"/>
           <w:sz w:val="20"/>
         </w:rPr>
-        <w:t>El código, los textos y el índice de esta medición quedaron congelados para reproducir estas respuestas. Falta publicar el corpus con un enlace que abra sin sesión iniciada y construir la interfaz.</w:t>
+        <w:t>Código, corpus e índice de esta medición quedaron congelados. Falta publicar el corpus y la interfaz.</w:t>
       </w:r>
     </w:p>
     <w:sectPr>
       <w:pgSz w:w="11906" w:h="16838"/>
-      <w:pgMar w:top="624" w:right="964" w:bottom="624" w:left="964" w:header="720" w:footer="720" w:gutter="0"/>
+      <w:pgMar w:top="567" w:right="964" w:bottom="567" w:left="964" w:header="720" w:footer="720" w:gutter="0"/>
       <w:cols w:space="720"/>
       <w:docGrid w:linePitch="360"/>
     </w:sectPr>

</xml_diff>